<commit_message>
F10: editor-style review of the revised manuscript; F9 coder statement corrected (AI model, not one person)
Co-Authored-By: Claude Opus 5.5 <noreply@anthropic.com>
Claude-Session: https://claude.ai/code/session_01M3YJt6DAJzNjXuq6VWebvL
</commit_message>
<xml_diff>
--- a/docs/sources/dac_paper/Decision_or_Supply_manuscript_F9_revised.docx
+++ b/docs/sources/dac_paper/Decision_or_Supply_manuscript_F9_revised.docx
@@ -959,7 +959,7 @@
       </w:del>
       <w:ins w:id="1013" w:author="Claude" w:date="2026-10-28T00:00:00Z">
         <w:r>
-          <w:t xml:space="preserve">Binding acts are reported but not compared, because their content differs. The event files were coded under rules fixed before coding, but by a coder who already knew the Belgian result and several first-order codings, so every coded date and lag is a test on known history, not a blind test; the cross-case statistics are exploratory.</w:t>
+          <w:t xml:space="preserve">Binding acts are reported but not compared, because their content differs. The event files were coded under rules fixed before coding, by one coder, an AI model (Claude), with every cited phrase checked automatically against its source page; the coder already knew the Belgian result and several first-order codings, so every coded date and lag is a test on known history, not a blind test; the cross-case statistics are exploratory.</w:t>
         </w:r>
       </w:ins>
     </w:p>
@@ -4781,7 +4781,7 @@
       </w:del>
       <w:ins w:id="1169" w:author="Claude" w:date="2026-10-28T00:00:00Z">
         <w:r>
-          <w:t xml:space="preserve">All files were coded by one person under rules fixed before coding, but with the Belgian result and several first-order codings already known to the coder, so they are a test on known history, not a blind test.</w:t>
+          <w:t xml:space="preserve">All files were coded by an AI model (Claude) under rules fixed before coding, with every cited phrase checked automatically against its source page; no human has yet recoded them, and the Belgian result and several first-order codings were known beforehand, so they are a test on known history, not a blind test.</w:t>
         </w:r>
       </w:ins>
       <w:r>

</xml_diff>